<commit_message>
docs: presupuesto real basado en horas y tarifa de mercado (ARS 16.016.000) en B1 y B6
Reemplaza los montos simulados por un cálculo de 1.040 h x ARS 14.000 + 10% de reserva.

Co-Authored-By: Claude Sonnet 5.5 <noreply@anthropic.com>
Claude-Session: https://claude.ai/code/session_016Qvd5iGcwUQveyPKApGB7y
</commit_message>
<xml_diff>
--- a/docs/entregables/B1_Contrato_Alcance_TILCOR.docx
+++ b/docs/entregables/B1_Contrato_Alcance_TILCOR.docx
@@ -1494,7 +1494,7 @@
           <w:sz w:val="21"/>
           <w:szCs w:val="21"/>
         </w:rPr>
-        <w:t xml:space="preserve">ARS 1.250.000 (precio fijo, proyecto cerrado).</w:t>
+        <w:t xml:space="preserve">ARS 16.016.000 (precio cerrado, aprox. USD 10.270).</w:t>
       </w:r>
     </w:p>
     <w:p>
@@ -1868,7 +1868,7 @@
                 <w:sz w:val="19"/>
                 <w:szCs w:val="19"/>
               </w:rPr>
-              <w:t xml:space="preserve">ARS 180.000</w:t>
+              <w:t xml:space="preserve">ARS 2.464.000</w:t>
             </w:r>
           </w:p>
         </w:tc>
@@ -2065,7 +2065,7 @@
                 <w:sz w:val="19"/>
                 <w:szCs w:val="19"/>
               </w:rPr>
-              <w:t xml:space="preserve">ARS 220.000</w:t>
+              <w:t xml:space="preserve">ARS 2.464.000</w:t>
             </w:r>
           </w:p>
         </w:tc>
@@ -2281,7 +2281,7 @@
                 <w:sz w:val="19"/>
                 <w:szCs w:val="19"/>
               </w:rPr>
-              <w:t xml:space="preserve">ARS 280.000</w:t>
+              <w:t xml:space="preserve">ARS 3.080.000</w:t>
             </w:r>
           </w:p>
         </w:tc>
@@ -2497,7 +2497,7 @@
                 <w:sz w:val="19"/>
                 <w:szCs w:val="19"/>
               </w:rPr>
-              <w:t xml:space="preserve">ARS 350.000</w:t>
+              <w:t xml:space="preserve">ARS 4.312.000</w:t>
             </w:r>
           </w:p>
         </w:tc>
@@ -2694,7 +2694,7 @@
                 <w:sz w:val="19"/>
                 <w:szCs w:val="19"/>
               </w:rPr>
-              <w:t xml:space="preserve">ARS 220.000</w:t>
+              <w:t xml:space="preserve">ARS 3.696.000</w:t>
             </w:r>
           </w:p>
         </w:tc>
@@ -2837,7 +2837,7 @@
                 <w:sz w:val="19"/>
                 <w:szCs w:val="19"/>
               </w:rPr>
-              <w:t xml:space="preserve">ARS 1.250.000</w:t>
+              <w:t xml:space="preserve">ARS 16.016.000</w:t>
             </w:r>
           </w:p>
         </w:tc>
@@ -2857,7 +2857,7 @@
           <w:sz w:val="21"/>
           <w:szCs w:val="21"/>
         </w:rPr>
-        <w:t xml:space="preserve">Detalle de pagos por fase</w:t>
+        <w:t xml:space="preserve">Cálculo del precio y pagos por fase</w:t>
       </w:r>
     </w:p>
     <w:tbl>
@@ -2873,10 +2873,12 @@
         </w:tblBorders>
       </w:tblPr>
       <w:tblGrid>
-        <w:gridCol w:w="1250"/>
-        <w:gridCol w:w="2300"/>
-        <w:gridCol w:w="2944"/>
-        <w:gridCol w:w="3144"/>
+        <w:gridCol w:w="900"/>
+        <w:gridCol w:w="1000"/>
+        <w:gridCol w:w="1800"/>
+        <w:gridCol w:w="1800"/>
+        <w:gridCol w:w="1900"/>
+        <w:gridCol w:w="2238"/>
       </w:tblGrid>
       <w:tr>
         <w:trPr>
@@ -2884,7 +2886,7 @@
         </w:trPr>
         <w:tc>
           <w:tcPr>
-            <w:tcW w:type="dxa" w:w="1250"/>
+            <w:tcW w:type="dxa" w:w="900"/>
             <w:tcBorders>
               <w:top w:val="single" w:color="AEB6BF" w:sz="4"/>
               <w:left w:val="single" w:color="AEB6BF" w:sz="4"/>
@@ -2919,7 +2921,7 @@
         </w:tc>
         <w:tc>
           <w:tcPr>
-            <w:tcW w:type="dxa" w:w="2300"/>
+            <w:tcW w:type="dxa" w:w="1000"/>
             <w:tcBorders>
               <w:top w:val="single" w:color="AEB6BF" w:sz="4"/>
               <w:left w:val="single" w:color="AEB6BF" w:sz="4"/>
@@ -2949,13 +2951,13 @@
                 <w:sz w:val="19"/>
                 <w:szCs w:val="19"/>
               </w:rPr>
-              <w:t xml:space="preserve">30 % al inicio</w:t>
-            </w:r>
-          </w:p>
-        </w:tc>
-        <w:tc>
-          <w:tcPr>
-            <w:tcW w:type="dxa" w:w="2944"/>
+              <w:t xml:space="preserve">Horas</w:t>
+            </w:r>
+          </w:p>
+        </w:tc>
+        <w:tc>
+          <w:tcPr>
+            <w:tcW w:type="dxa" w:w="1800"/>
             <w:tcBorders>
               <w:top w:val="single" w:color="AEB6BF" w:sz="4"/>
               <w:left w:val="single" w:color="AEB6BF" w:sz="4"/>
@@ -2985,13 +2987,13 @@
                 <w:sz w:val="19"/>
                 <w:szCs w:val="19"/>
               </w:rPr>
-              <w:t xml:space="preserve">70 % al hito de cierre</w:t>
-            </w:r>
-          </w:p>
-        </w:tc>
-        <w:tc>
-          <w:tcPr>
-            <w:tcW w:type="dxa" w:w="3144"/>
+              <w:t xml:space="preserve">Horas × ARS 14.000</w:t>
+            </w:r>
+          </w:p>
+        </w:tc>
+        <w:tc>
+          <w:tcPr>
+            <w:tcW w:type="dxa" w:w="1800"/>
             <w:tcBorders>
               <w:top w:val="single" w:color="AEB6BF" w:sz="4"/>
               <w:left w:val="single" w:color="AEB6BF" w:sz="4"/>
@@ -3021,7 +3023,79 @@
                 <w:sz w:val="19"/>
                 <w:szCs w:val="19"/>
               </w:rPr>
-              <w:t xml:space="preserve">Total de la fase</w:t>
+              <w:t xml:space="preserve">Reserva 10 %</w:t>
+            </w:r>
+          </w:p>
+        </w:tc>
+        <w:tc>
+          <w:tcPr>
+            <w:tcW w:type="dxa" w:w="1900"/>
+            <w:tcBorders>
+              <w:top w:val="single" w:color="AEB6BF" w:sz="4"/>
+              <w:left w:val="single" w:color="AEB6BF" w:sz="4"/>
+              <w:bottom w:val="single" w:color="AEB6BF" w:sz="4"/>
+              <w:right w:val="single" w:color="AEB6BF" w:sz="4"/>
+            </w:tcBorders>
+            <w:shd w:fill="1A5276" w:color="auto" w:val="clear"/>
+            <w:tcMar>
+              <w:top w:type="dxa" w:w="90"/>
+              <w:left w:type="dxa" w:w="110"/>
+              <w:bottom w:type="dxa" w:w="90"/>
+              <w:right w:type="dxa" w:w="110"/>
+            </w:tcMar>
+            <w:vAlign w:val="center"/>
+          </w:tcPr>
+          <w:p>
+            <w:pPr>
+              <w:spacing w:after="0" w:line="270"/>
+              <w:jc w:val="right"/>
+            </w:pPr>
+            <w:r>
+              <w:rPr>
+                <w:rFonts w:ascii="Arial" w:cs="Arial" w:eastAsia="Arial" w:hAnsi="Arial"/>
+                <w:b/>
+                <w:bCs/>
+                <w:color w:val="FFFFFF"/>
+                <w:sz w:val="19"/>
+                <w:szCs w:val="19"/>
+              </w:rPr>
+              <w:t xml:space="preserve">30 % al inicio</w:t>
+            </w:r>
+          </w:p>
+        </w:tc>
+        <w:tc>
+          <w:tcPr>
+            <w:tcW w:type="dxa" w:w="2238"/>
+            <w:tcBorders>
+              <w:top w:val="single" w:color="AEB6BF" w:sz="4"/>
+              <w:left w:val="single" w:color="AEB6BF" w:sz="4"/>
+              <w:bottom w:val="single" w:color="AEB6BF" w:sz="4"/>
+              <w:right w:val="single" w:color="AEB6BF" w:sz="4"/>
+            </w:tcBorders>
+            <w:shd w:fill="1A5276" w:color="auto" w:val="clear"/>
+            <w:tcMar>
+              <w:top w:type="dxa" w:w="90"/>
+              <w:left w:type="dxa" w:w="110"/>
+              <w:bottom w:type="dxa" w:w="90"/>
+              <w:right w:type="dxa" w:w="110"/>
+            </w:tcMar>
+            <w:vAlign w:val="center"/>
+          </w:tcPr>
+          <w:p>
+            <w:pPr>
+              <w:spacing w:after="0" w:line="270"/>
+              <w:jc w:val="right"/>
+            </w:pPr>
+            <w:r>
+              <w:rPr>
+                <w:rFonts w:ascii="Arial" w:cs="Arial" w:eastAsia="Arial" w:hAnsi="Arial"/>
+                <w:b/>
+                <w:bCs/>
+                <w:color w:val="FFFFFF"/>
+                <w:sz w:val="19"/>
+                <w:szCs w:val="19"/>
+              </w:rPr>
+              <w:t xml:space="preserve">70 % al hito de cierre</w:t>
             </w:r>
           </w:p>
         </w:tc>
@@ -3032,7 +3106,7 @@
         </w:trPr>
         <w:tc>
           <w:tcPr>
-            <w:tcW w:type="dxa" w:w="1250"/>
+            <w:tcW w:type="dxa" w:w="900"/>
             <w:tcBorders>
               <w:top w:val="single" w:color="AEB6BF" w:sz="4"/>
               <w:left w:val="single" w:color="AEB6BF" w:sz="4"/>
@@ -3066,7 +3140,7 @@
         </w:tc>
         <w:tc>
           <w:tcPr>
-            <w:tcW w:type="dxa" w:w="2300"/>
+            <w:tcW w:type="dxa" w:w="1000"/>
             <w:tcBorders>
               <w:top w:val="single" w:color="AEB6BF" w:sz="4"/>
               <w:left w:val="single" w:color="AEB6BF" w:sz="4"/>
@@ -3093,13 +3167,13 @@
                 <w:sz w:val="19"/>
                 <w:szCs w:val="19"/>
               </w:rPr>
-              <w:t xml:space="preserve">ARS 54.000</w:t>
-            </w:r>
-          </w:p>
-        </w:tc>
-        <w:tc>
-          <w:tcPr>
-            <w:tcW w:type="dxa" w:w="2944"/>
+              <w:t xml:space="preserve">160 h</w:t>
+            </w:r>
+          </w:p>
+        </w:tc>
+        <w:tc>
+          <w:tcPr>
+            <w:tcW w:type="dxa" w:w="1800"/>
             <w:tcBorders>
               <w:top w:val="single" w:color="AEB6BF" w:sz="4"/>
               <w:left w:val="single" w:color="AEB6BF" w:sz="4"/>
@@ -3126,13 +3200,13 @@
                 <w:sz w:val="19"/>
                 <w:szCs w:val="19"/>
               </w:rPr>
-              <w:t xml:space="preserve">ARS 126.000</w:t>
-            </w:r>
-          </w:p>
-        </w:tc>
-        <w:tc>
-          <w:tcPr>
-            <w:tcW w:type="dxa" w:w="3144"/>
+              <w:t xml:space="preserve">ARS 2.240.000</w:t>
+            </w:r>
+          </w:p>
+        </w:tc>
+        <w:tc>
+          <w:tcPr>
+            <w:tcW w:type="dxa" w:w="1800"/>
             <w:tcBorders>
               <w:top w:val="single" w:color="AEB6BF" w:sz="4"/>
               <w:left w:val="single" w:color="AEB6BF" w:sz="4"/>
@@ -3155,13 +3229,77 @@
             <w:r>
               <w:rPr>
                 <w:rFonts w:ascii="Arial" w:cs="Arial" w:eastAsia="Arial" w:hAnsi="Arial"/>
-                <w:b/>
-                <w:bCs/>
-                <w:color w:val="1A202C"/>
-                <w:sz w:val="19"/>
-                <w:szCs w:val="19"/>
-              </w:rPr>
-              <w:t xml:space="preserve">ARS 180.000</w:t>
+                <w:color w:val="1A202C"/>
+                <w:sz w:val="19"/>
+                <w:szCs w:val="19"/>
+              </w:rPr>
+              <w:t xml:space="preserve">ARS 224.000</w:t>
+            </w:r>
+          </w:p>
+        </w:tc>
+        <w:tc>
+          <w:tcPr>
+            <w:tcW w:type="dxa" w:w="1900"/>
+            <w:tcBorders>
+              <w:top w:val="single" w:color="AEB6BF" w:sz="4"/>
+              <w:left w:val="single" w:color="AEB6BF" w:sz="4"/>
+              <w:bottom w:val="single" w:color="AEB6BF" w:sz="4"/>
+              <w:right w:val="single" w:color="AEB6BF" w:sz="4"/>
+            </w:tcBorders>
+            <w:tcMar>
+              <w:top w:type="dxa" w:w="90"/>
+              <w:left w:type="dxa" w:w="110"/>
+              <w:bottom w:type="dxa" w:w="90"/>
+              <w:right w:type="dxa" w:w="110"/>
+            </w:tcMar>
+            <w:vAlign w:val="center"/>
+          </w:tcPr>
+          <w:p>
+            <w:pPr>
+              <w:spacing w:after="0" w:line="270"/>
+              <w:jc w:val="right"/>
+            </w:pPr>
+            <w:r>
+              <w:rPr>
+                <w:rFonts w:ascii="Arial" w:cs="Arial" w:eastAsia="Arial" w:hAnsi="Arial"/>
+                <w:color w:val="1A202C"/>
+                <w:sz w:val="19"/>
+                <w:szCs w:val="19"/>
+              </w:rPr>
+              <w:t xml:space="preserve">ARS 739.200</w:t>
+            </w:r>
+          </w:p>
+        </w:tc>
+        <w:tc>
+          <w:tcPr>
+            <w:tcW w:type="dxa" w:w="2238"/>
+            <w:tcBorders>
+              <w:top w:val="single" w:color="AEB6BF" w:sz="4"/>
+              <w:left w:val="single" w:color="AEB6BF" w:sz="4"/>
+              <w:bottom w:val="single" w:color="AEB6BF" w:sz="4"/>
+              <w:right w:val="single" w:color="AEB6BF" w:sz="4"/>
+            </w:tcBorders>
+            <w:tcMar>
+              <w:top w:type="dxa" w:w="90"/>
+              <w:left w:type="dxa" w:w="110"/>
+              <w:bottom w:type="dxa" w:w="90"/>
+              <w:right w:type="dxa" w:w="110"/>
+            </w:tcMar>
+            <w:vAlign w:val="center"/>
+          </w:tcPr>
+          <w:p>
+            <w:pPr>
+              <w:spacing w:after="0" w:line="270"/>
+              <w:jc w:val="right"/>
+            </w:pPr>
+            <w:r>
+              <w:rPr>
+                <w:rFonts w:ascii="Arial" w:cs="Arial" w:eastAsia="Arial" w:hAnsi="Arial"/>
+                <w:color w:val="1A202C"/>
+                <w:sz w:val="19"/>
+                <w:szCs w:val="19"/>
+              </w:rPr>
+              <w:t xml:space="preserve">ARS 1.724.800</w:t>
             </w:r>
           </w:p>
         </w:tc>
@@ -3172,7 +3310,7 @@
         </w:trPr>
         <w:tc>
           <w:tcPr>
-            <w:tcW w:type="dxa" w:w="1250"/>
+            <w:tcW w:type="dxa" w:w="900"/>
             <w:tcBorders>
               <w:top w:val="single" w:color="AEB6BF" w:sz="4"/>
               <w:left w:val="single" w:color="AEB6BF" w:sz="4"/>
@@ -3206,7 +3344,7 @@
         </w:tc>
         <w:tc>
           <w:tcPr>
-            <w:tcW w:type="dxa" w:w="2300"/>
+            <w:tcW w:type="dxa" w:w="1000"/>
             <w:tcBorders>
               <w:top w:val="single" w:color="AEB6BF" w:sz="4"/>
               <w:left w:val="single" w:color="AEB6BF" w:sz="4"/>
@@ -3233,13 +3371,13 @@
                 <w:sz w:val="19"/>
                 <w:szCs w:val="19"/>
               </w:rPr>
-              <w:t xml:space="preserve">ARS 66.000</w:t>
-            </w:r>
-          </w:p>
-        </w:tc>
-        <w:tc>
-          <w:tcPr>
-            <w:tcW w:type="dxa" w:w="2944"/>
+              <w:t xml:space="preserve">160 h</w:t>
+            </w:r>
+          </w:p>
+        </w:tc>
+        <w:tc>
+          <w:tcPr>
+            <w:tcW w:type="dxa" w:w="1800"/>
             <w:tcBorders>
               <w:top w:val="single" w:color="AEB6BF" w:sz="4"/>
               <w:left w:val="single" w:color="AEB6BF" w:sz="4"/>
@@ -3266,13 +3404,13 @@
                 <w:sz w:val="19"/>
                 <w:szCs w:val="19"/>
               </w:rPr>
-              <w:t xml:space="preserve">ARS 154.000</w:t>
-            </w:r>
-          </w:p>
-        </w:tc>
-        <w:tc>
-          <w:tcPr>
-            <w:tcW w:type="dxa" w:w="3144"/>
+              <w:t xml:space="preserve">ARS 2.240.000</w:t>
+            </w:r>
+          </w:p>
+        </w:tc>
+        <w:tc>
+          <w:tcPr>
+            <w:tcW w:type="dxa" w:w="1800"/>
             <w:tcBorders>
               <w:top w:val="single" w:color="AEB6BF" w:sz="4"/>
               <w:left w:val="single" w:color="AEB6BF" w:sz="4"/>
@@ -3295,13 +3433,77 @@
             <w:r>
               <w:rPr>
                 <w:rFonts w:ascii="Arial" w:cs="Arial" w:eastAsia="Arial" w:hAnsi="Arial"/>
-                <w:b/>
-                <w:bCs/>
-                <w:color w:val="1A202C"/>
-                <w:sz w:val="19"/>
-                <w:szCs w:val="19"/>
-              </w:rPr>
-              <w:t xml:space="preserve">ARS 220.000</w:t>
+                <w:color w:val="1A202C"/>
+                <w:sz w:val="19"/>
+                <w:szCs w:val="19"/>
+              </w:rPr>
+              <w:t xml:space="preserve">ARS 224.000</w:t>
+            </w:r>
+          </w:p>
+        </w:tc>
+        <w:tc>
+          <w:tcPr>
+            <w:tcW w:type="dxa" w:w="1900"/>
+            <w:tcBorders>
+              <w:top w:val="single" w:color="AEB6BF" w:sz="4"/>
+              <w:left w:val="single" w:color="AEB6BF" w:sz="4"/>
+              <w:bottom w:val="single" w:color="AEB6BF" w:sz="4"/>
+              <w:right w:val="single" w:color="AEB6BF" w:sz="4"/>
+            </w:tcBorders>
+            <w:tcMar>
+              <w:top w:type="dxa" w:w="90"/>
+              <w:left w:type="dxa" w:w="110"/>
+              <w:bottom w:type="dxa" w:w="90"/>
+              <w:right w:type="dxa" w:w="110"/>
+            </w:tcMar>
+            <w:vAlign w:val="center"/>
+          </w:tcPr>
+          <w:p>
+            <w:pPr>
+              <w:spacing w:after="0" w:line="270"/>
+              <w:jc w:val="right"/>
+            </w:pPr>
+            <w:r>
+              <w:rPr>
+                <w:rFonts w:ascii="Arial" w:cs="Arial" w:eastAsia="Arial" w:hAnsi="Arial"/>
+                <w:color w:val="1A202C"/>
+                <w:sz w:val="19"/>
+                <w:szCs w:val="19"/>
+              </w:rPr>
+              <w:t xml:space="preserve">ARS 739.200</w:t>
+            </w:r>
+          </w:p>
+        </w:tc>
+        <w:tc>
+          <w:tcPr>
+            <w:tcW w:type="dxa" w:w="2238"/>
+            <w:tcBorders>
+              <w:top w:val="single" w:color="AEB6BF" w:sz="4"/>
+              <w:left w:val="single" w:color="AEB6BF" w:sz="4"/>
+              <w:bottom w:val="single" w:color="AEB6BF" w:sz="4"/>
+              <w:right w:val="single" w:color="AEB6BF" w:sz="4"/>
+            </w:tcBorders>
+            <w:tcMar>
+              <w:top w:type="dxa" w:w="90"/>
+              <w:left w:type="dxa" w:w="110"/>
+              <w:bottom w:type="dxa" w:w="90"/>
+              <w:right w:type="dxa" w:w="110"/>
+            </w:tcMar>
+            <w:vAlign w:val="center"/>
+          </w:tcPr>
+          <w:p>
+            <w:pPr>
+              <w:spacing w:after="0" w:line="270"/>
+              <w:jc w:val="right"/>
+            </w:pPr>
+            <w:r>
+              <w:rPr>
+                <w:rFonts w:ascii="Arial" w:cs="Arial" w:eastAsia="Arial" w:hAnsi="Arial"/>
+                <w:color w:val="1A202C"/>
+                <w:sz w:val="19"/>
+                <w:szCs w:val="19"/>
+              </w:rPr>
+              <w:t xml:space="preserve">ARS 1.724.800</w:t>
             </w:r>
           </w:p>
         </w:tc>
@@ -3312,7 +3514,7 @@
         </w:trPr>
         <w:tc>
           <w:tcPr>
-            <w:tcW w:type="dxa" w:w="1250"/>
+            <w:tcW w:type="dxa" w:w="900"/>
             <w:tcBorders>
               <w:top w:val="single" w:color="AEB6BF" w:sz="4"/>
               <w:left w:val="single" w:color="AEB6BF" w:sz="4"/>
@@ -3346,7 +3548,7 @@
         </w:tc>
         <w:tc>
           <w:tcPr>
-            <w:tcW w:type="dxa" w:w="2300"/>
+            <w:tcW w:type="dxa" w:w="1000"/>
             <w:tcBorders>
               <w:top w:val="single" w:color="AEB6BF" w:sz="4"/>
               <w:left w:val="single" w:color="AEB6BF" w:sz="4"/>
@@ -3373,13 +3575,13 @@
                 <w:sz w:val="19"/>
                 <w:szCs w:val="19"/>
               </w:rPr>
-              <w:t xml:space="preserve">ARS 84.000</w:t>
-            </w:r>
-          </w:p>
-        </w:tc>
-        <w:tc>
-          <w:tcPr>
-            <w:tcW w:type="dxa" w:w="2944"/>
+              <w:t xml:space="preserve">200 h</w:t>
+            </w:r>
+          </w:p>
+        </w:tc>
+        <w:tc>
+          <w:tcPr>
+            <w:tcW w:type="dxa" w:w="1800"/>
             <w:tcBorders>
               <w:top w:val="single" w:color="AEB6BF" w:sz="4"/>
               <w:left w:val="single" w:color="AEB6BF" w:sz="4"/>
@@ -3406,13 +3608,13 @@
                 <w:sz w:val="19"/>
                 <w:szCs w:val="19"/>
               </w:rPr>
-              <w:t xml:space="preserve">ARS 196.000</w:t>
-            </w:r>
-          </w:p>
-        </w:tc>
-        <w:tc>
-          <w:tcPr>
-            <w:tcW w:type="dxa" w:w="3144"/>
+              <w:t xml:space="preserve">ARS 2.800.000</w:t>
+            </w:r>
+          </w:p>
+        </w:tc>
+        <w:tc>
+          <w:tcPr>
+            <w:tcW w:type="dxa" w:w="1800"/>
             <w:tcBorders>
               <w:top w:val="single" w:color="AEB6BF" w:sz="4"/>
               <w:left w:val="single" w:color="AEB6BF" w:sz="4"/>
@@ -3435,13 +3637,77 @@
             <w:r>
               <w:rPr>
                 <w:rFonts w:ascii="Arial" w:cs="Arial" w:eastAsia="Arial" w:hAnsi="Arial"/>
-                <w:b/>
-                <w:bCs/>
                 <w:color w:val="1A202C"/>
                 <w:sz w:val="19"/>
                 <w:szCs w:val="19"/>
               </w:rPr>
               <w:t xml:space="preserve">ARS 280.000</w:t>
+            </w:r>
+          </w:p>
+        </w:tc>
+        <w:tc>
+          <w:tcPr>
+            <w:tcW w:type="dxa" w:w="1900"/>
+            <w:tcBorders>
+              <w:top w:val="single" w:color="AEB6BF" w:sz="4"/>
+              <w:left w:val="single" w:color="AEB6BF" w:sz="4"/>
+              <w:bottom w:val="single" w:color="AEB6BF" w:sz="4"/>
+              <w:right w:val="single" w:color="AEB6BF" w:sz="4"/>
+            </w:tcBorders>
+            <w:tcMar>
+              <w:top w:type="dxa" w:w="90"/>
+              <w:left w:type="dxa" w:w="110"/>
+              <w:bottom w:type="dxa" w:w="90"/>
+              <w:right w:type="dxa" w:w="110"/>
+            </w:tcMar>
+            <w:vAlign w:val="center"/>
+          </w:tcPr>
+          <w:p>
+            <w:pPr>
+              <w:spacing w:after="0" w:line="270"/>
+              <w:jc w:val="right"/>
+            </w:pPr>
+            <w:r>
+              <w:rPr>
+                <w:rFonts w:ascii="Arial" w:cs="Arial" w:eastAsia="Arial" w:hAnsi="Arial"/>
+                <w:color w:val="1A202C"/>
+                <w:sz w:val="19"/>
+                <w:szCs w:val="19"/>
+              </w:rPr>
+              <w:t xml:space="preserve">ARS 924.000</w:t>
+            </w:r>
+          </w:p>
+        </w:tc>
+        <w:tc>
+          <w:tcPr>
+            <w:tcW w:type="dxa" w:w="2238"/>
+            <w:tcBorders>
+              <w:top w:val="single" w:color="AEB6BF" w:sz="4"/>
+              <w:left w:val="single" w:color="AEB6BF" w:sz="4"/>
+              <w:bottom w:val="single" w:color="AEB6BF" w:sz="4"/>
+              <w:right w:val="single" w:color="AEB6BF" w:sz="4"/>
+            </w:tcBorders>
+            <w:tcMar>
+              <w:top w:type="dxa" w:w="90"/>
+              <w:left w:type="dxa" w:w="110"/>
+              <w:bottom w:type="dxa" w:w="90"/>
+              <w:right w:type="dxa" w:w="110"/>
+            </w:tcMar>
+            <w:vAlign w:val="center"/>
+          </w:tcPr>
+          <w:p>
+            <w:pPr>
+              <w:spacing w:after="0" w:line="270"/>
+              <w:jc w:val="right"/>
+            </w:pPr>
+            <w:r>
+              <w:rPr>
+                <w:rFonts w:ascii="Arial" w:cs="Arial" w:eastAsia="Arial" w:hAnsi="Arial"/>
+                <w:color w:val="1A202C"/>
+                <w:sz w:val="19"/>
+                <w:szCs w:val="19"/>
+              </w:rPr>
+              <w:t xml:space="preserve">ARS 2.156.000</w:t>
             </w:r>
           </w:p>
         </w:tc>
@@ -3452,7 +3718,7 @@
         </w:trPr>
         <w:tc>
           <w:tcPr>
-            <w:tcW w:type="dxa" w:w="1250"/>
+            <w:tcW w:type="dxa" w:w="900"/>
             <w:tcBorders>
               <w:top w:val="single" w:color="AEB6BF" w:sz="4"/>
               <w:left w:val="single" w:color="AEB6BF" w:sz="4"/>
@@ -3486,7 +3752,7 @@
         </w:tc>
         <w:tc>
           <w:tcPr>
-            <w:tcW w:type="dxa" w:w="2300"/>
+            <w:tcW w:type="dxa" w:w="1000"/>
             <w:tcBorders>
               <w:top w:val="single" w:color="AEB6BF" w:sz="4"/>
               <w:left w:val="single" w:color="AEB6BF" w:sz="4"/>
@@ -3513,13 +3779,13 @@
                 <w:sz w:val="19"/>
                 <w:szCs w:val="19"/>
               </w:rPr>
-              <w:t xml:space="preserve">ARS 105.000</w:t>
-            </w:r>
-          </w:p>
-        </w:tc>
-        <w:tc>
-          <w:tcPr>
-            <w:tcW w:type="dxa" w:w="2944"/>
+              <w:t xml:space="preserve">280 h</w:t>
+            </w:r>
+          </w:p>
+        </w:tc>
+        <w:tc>
+          <w:tcPr>
+            <w:tcW w:type="dxa" w:w="1800"/>
             <w:tcBorders>
               <w:top w:val="single" w:color="AEB6BF" w:sz="4"/>
               <w:left w:val="single" w:color="AEB6BF" w:sz="4"/>
@@ -3546,13 +3812,13 @@
                 <w:sz w:val="19"/>
                 <w:szCs w:val="19"/>
               </w:rPr>
-              <w:t xml:space="preserve">ARS 245.000</w:t>
-            </w:r>
-          </w:p>
-        </w:tc>
-        <w:tc>
-          <w:tcPr>
-            <w:tcW w:type="dxa" w:w="3144"/>
+              <w:t xml:space="preserve">ARS 3.920.000</w:t>
+            </w:r>
+          </w:p>
+        </w:tc>
+        <w:tc>
+          <w:tcPr>
+            <w:tcW w:type="dxa" w:w="1800"/>
             <w:tcBorders>
               <w:top w:val="single" w:color="AEB6BF" w:sz="4"/>
               <w:left w:val="single" w:color="AEB6BF" w:sz="4"/>
@@ -3575,13 +3841,77 @@
             <w:r>
               <w:rPr>
                 <w:rFonts w:ascii="Arial" w:cs="Arial" w:eastAsia="Arial" w:hAnsi="Arial"/>
-                <w:b/>
-                <w:bCs/>
-                <w:color w:val="1A202C"/>
-                <w:sz w:val="19"/>
-                <w:szCs w:val="19"/>
-              </w:rPr>
-              <w:t xml:space="preserve">ARS 350.000</w:t>
+                <w:color w:val="1A202C"/>
+                <w:sz w:val="19"/>
+                <w:szCs w:val="19"/>
+              </w:rPr>
+              <w:t xml:space="preserve">ARS 392.000</w:t>
+            </w:r>
+          </w:p>
+        </w:tc>
+        <w:tc>
+          <w:tcPr>
+            <w:tcW w:type="dxa" w:w="1900"/>
+            <w:tcBorders>
+              <w:top w:val="single" w:color="AEB6BF" w:sz="4"/>
+              <w:left w:val="single" w:color="AEB6BF" w:sz="4"/>
+              <w:bottom w:val="single" w:color="AEB6BF" w:sz="4"/>
+              <w:right w:val="single" w:color="AEB6BF" w:sz="4"/>
+            </w:tcBorders>
+            <w:tcMar>
+              <w:top w:type="dxa" w:w="90"/>
+              <w:left w:type="dxa" w:w="110"/>
+              <w:bottom w:type="dxa" w:w="90"/>
+              <w:right w:type="dxa" w:w="110"/>
+            </w:tcMar>
+            <w:vAlign w:val="center"/>
+          </w:tcPr>
+          <w:p>
+            <w:pPr>
+              <w:spacing w:after="0" w:line="270"/>
+              <w:jc w:val="right"/>
+            </w:pPr>
+            <w:r>
+              <w:rPr>
+                <w:rFonts w:ascii="Arial" w:cs="Arial" w:eastAsia="Arial" w:hAnsi="Arial"/>
+                <w:color w:val="1A202C"/>
+                <w:sz w:val="19"/>
+                <w:szCs w:val="19"/>
+              </w:rPr>
+              <w:t xml:space="preserve">ARS 1.293.600</w:t>
+            </w:r>
+          </w:p>
+        </w:tc>
+        <w:tc>
+          <w:tcPr>
+            <w:tcW w:type="dxa" w:w="2238"/>
+            <w:tcBorders>
+              <w:top w:val="single" w:color="AEB6BF" w:sz="4"/>
+              <w:left w:val="single" w:color="AEB6BF" w:sz="4"/>
+              <w:bottom w:val="single" w:color="AEB6BF" w:sz="4"/>
+              <w:right w:val="single" w:color="AEB6BF" w:sz="4"/>
+            </w:tcBorders>
+            <w:tcMar>
+              <w:top w:type="dxa" w:w="90"/>
+              <w:left w:type="dxa" w:w="110"/>
+              <w:bottom w:type="dxa" w:w="90"/>
+              <w:right w:type="dxa" w:w="110"/>
+            </w:tcMar>
+            <w:vAlign w:val="center"/>
+          </w:tcPr>
+          <w:p>
+            <w:pPr>
+              <w:spacing w:after="0" w:line="270"/>
+              <w:jc w:val="right"/>
+            </w:pPr>
+            <w:r>
+              <w:rPr>
+                <w:rFonts w:ascii="Arial" w:cs="Arial" w:eastAsia="Arial" w:hAnsi="Arial"/>
+                <w:color w:val="1A202C"/>
+                <w:sz w:val="19"/>
+                <w:szCs w:val="19"/>
+              </w:rPr>
+              <w:t xml:space="preserve">ARS 3.018.400</w:t>
             </w:r>
           </w:p>
         </w:tc>
@@ -3592,7 +3922,7 @@
         </w:trPr>
         <w:tc>
           <w:tcPr>
-            <w:tcW w:type="dxa" w:w="1250"/>
+            <w:tcW w:type="dxa" w:w="900"/>
             <w:tcBorders>
               <w:top w:val="single" w:color="AEB6BF" w:sz="4"/>
               <w:left w:val="single" w:color="AEB6BF" w:sz="4"/>
@@ -3626,7 +3956,7 @@
         </w:tc>
         <w:tc>
           <w:tcPr>
-            <w:tcW w:type="dxa" w:w="2300"/>
+            <w:tcW w:type="dxa" w:w="1000"/>
             <w:tcBorders>
               <w:top w:val="single" w:color="AEB6BF" w:sz="4"/>
               <w:left w:val="single" w:color="AEB6BF" w:sz="4"/>
@@ -3653,13 +3983,13 @@
                 <w:sz w:val="19"/>
                 <w:szCs w:val="19"/>
               </w:rPr>
-              <w:t xml:space="preserve">ARS 66.000</w:t>
-            </w:r>
-          </w:p>
-        </w:tc>
-        <w:tc>
-          <w:tcPr>
-            <w:tcW w:type="dxa" w:w="2944"/>
+              <w:t xml:space="preserve">240 h</w:t>
+            </w:r>
+          </w:p>
+        </w:tc>
+        <w:tc>
+          <w:tcPr>
+            <w:tcW w:type="dxa" w:w="1800"/>
             <w:tcBorders>
               <w:top w:val="single" w:color="AEB6BF" w:sz="4"/>
               <w:left w:val="single" w:color="AEB6BF" w:sz="4"/>
@@ -3686,13 +4016,13 @@
                 <w:sz w:val="19"/>
                 <w:szCs w:val="19"/>
               </w:rPr>
-              <w:t xml:space="preserve">ARS 154.000</w:t>
-            </w:r>
-          </w:p>
-        </w:tc>
-        <w:tc>
-          <w:tcPr>
-            <w:tcW w:type="dxa" w:w="3144"/>
+              <w:t xml:space="preserve">ARS 3.360.000</w:t>
+            </w:r>
+          </w:p>
+        </w:tc>
+        <w:tc>
+          <w:tcPr>
+            <w:tcW w:type="dxa" w:w="1800"/>
             <w:tcBorders>
               <w:top w:val="single" w:color="AEB6BF" w:sz="4"/>
               <w:left w:val="single" w:color="AEB6BF" w:sz="4"/>
@@ -3711,6 +4041,107 @@
             <w:pPr>
               <w:spacing w:after="0" w:line="270"/>
               <w:jc w:val="right"/>
+            </w:pPr>
+            <w:r>
+              <w:rPr>
+                <w:rFonts w:ascii="Arial" w:cs="Arial" w:eastAsia="Arial" w:hAnsi="Arial"/>
+                <w:color w:val="1A202C"/>
+                <w:sz w:val="19"/>
+                <w:szCs w:val="19"/>
+              </w:rPr>
+              <w:t xml:space="preserve">ARS 336.000</w:t>
+            </w:r>
+          </w:p>
+        </w:tc>
+        <w:tc>
+          <w:tcPr>
+            <w:tcW w:type="dxa" w:w="1900"/>
+            <w:tcBorders>
+              <w:top w:val="single" w:color="AEB6BF" w:sz="4"/>
+              <w:left w:val="single" w:color="AEB6BF" w:sz="4"/>
+              <w:bottom w:val="single" w:color="AEB6BF" w:sz="4"/>
+              <w:right w:val="single" w:color="AEB6BF" w:sz="4"/>
+            </w:tcBorders>
+            <w:tcMar>
+              <w:top w:type="dxa" w:w="90"/>
+              <w:left w:type="dxa" w:w="110"/>
+              <w:bottom w:type="dxa" w:w="90"/>
+              <w:right w:type="dxa" w:w="110"/>
+            </w:tcMar>
+            <w:vAlign w:val="center"/>
+          </w:tcPr>
+          <w:p>
+            <w:pPr>
+              <w:spacing w:after="0" w:line="270"/>
+              <w:jc w:val="right"/>
+            </w:pPr>
+            <w:r>
+              <w:rPr>
+                <w:rFonts w:ascii="Arial" w:cs="Arial" w:eastAsia="Arial" w:hAnsi="Arial"/>
+                <w:color w:val="1A202C"/>
+                <w:sz w:val="19"/>
+                <w:szCs w:val="19"/>
+              </w:rPr>
+              <w:t xml:space="preserve">ARS 1.108.800</w:t>
+            </w:r>
+          </w:p>
+        </w:tc>
+        <w:tc>
+          <w:tcPr>
+            <w:tcW w:type="dxa" w:w="2238"/>
+            <w:tcBorders>
+              <w:top w:val="single" w:color="AEB6BF" w:sz="4"/>
+              <w:left w:val="single" w:color="AEB6BF" w:sz="4"/>
+              <w:bottom w:val="single" w:color="AEB6BF" w:sz="4"/>
+              <w:right w:val="single" w:color="AEB6BF" w:sz="4"/>
+            </w:tcBorders>
+            <w:tcMar>
+              <w:top w:type="dxa" w:w="90"/>
+              <w:left w:type="dxa" w:w="110"/>
+              <w:bottom w:type="dxa" w:w="90"/>
+              <w:right w:type="dxa" w:w="110"/>
+            </w:tcMar>
+            <w:vAlign w:val="center"/>
+          </w:tcPr>
+          <w:p>
+            <w:pPr>
+              <w:spacing w:after="0" w:line="270"/>
+              <w:jc w:val="right"/>
+            </w:pPr>
+            <w:r>
+              <w:rPr>
+                <w:rFonts w:ascii="Arial" w:cs="Arial" w:eastAsia="Arial" w:hAnsi="Arial"/>
+                <w:color w:val="1A202C"/>
+                <w:sz w:val="19"/>
+                <w:szCs w:val="19"/>
+              </w:rPr>
+              <w:t xml:space="preserve">ARS 2.587.200</w:t>
+            </w:r>
+          </w:p>
+        </w:tc>
+      </w:tr>
+      <w:tr>
+        <w:tc>
+          <w:tcPr>
+            <w:tcW w:type="dxa" w:w="900"/>
+            <w:tcBorders>
+              <w:top w:val="single" w:color="AEB6BF" w:sz="4"/>
+              <w:left w:val="single" w:color="AEB6BF" w:sz="4"/>
+              <w:bottom w:val="single" w:color="AEB6BF" w:sz="4"/>
+              <w:right w:val="single" w:color="AEB6BF" w:sz="4"/>
+            </w:tcBorders>
+            <w:shd w:fill="D6EAF8" w:color="auto" w:val="clear"/>
+            <w:tcMar>
+              <w:top w:type="dxa" w:w="90"/>
+              <w:left w:type="dxa" w:w="110"/>
+              <w:bottom w:type="dxa" w:w="90"/>
+              <w:right w:type="dxa" w:w="110"/>
+            </w:tcMar>
+            <w:vAlign w:val="center"/>
+          </w:tcPr>
+          <w:p>
+            <w:pPr>
+              <w:spacing w:after="0" w:line="270"/>
             </w:pPr>
             <w:r>
               <w:rPr>
@@ -3721,15 +4152,13 @@
                 <w:sz w:val="19"/>
                 <w:szCs w:val="19"/>
               </w:rPr>
-              <w:t xml:space="preserve">ARS 220.000</w:t>
-            </w:r>
-          </w:p>
-        </w:tc>
-      </w:tr>
-      <w:tr>
-        <w:tc>
-          <w:tcPr>
-            <w:tcW w:type="dxa" w:w="1250"/>
+              <w:t xml:space="preserve">Total</w:t>
+            </w:r>
+          </w:p>
+        </w:tc>
+        <w:tc>
+          <w:tcPr>
+            <w:tcW w:type="dxa" w:w="1000"/>
             <w:tcBorders>
               <w:top w:val="single" w:color="AEB6BF" w:sz="4"/>
               <w:left w:val="single" w:color="AEB6BF" w:sz="4"/>
@@ -3748,6 +4177,7 @@
           <w:p>
             <w:pPr>
               <w:spacing w:after="0" w:line="270"/>
+              <w:jc w:val="right"/>
             </w:pPr>
             <w:r>
               <w:rPr>
@@ -3758,13 +4188,13 @@
                 <w:sz w:val="19"/>
                 <w:szCs w:val="19"/>
               </w:rPr>
-              <w:t xml:space="preserve">Total</w:t>
-            </w:r>
-          </w:p>
-        </w:tc>
-        <w:tc>
-          <w:tcPr>
-            <w:tcW w:type="dxa" w:w="2300"/>
+              <w:t xml:space="preserve">1.040 h</w:t>
+            </w:r>
+          </w:p>
+        </w:tc>
+        <w:tc>
+          <w:tcPr>
+            <w:tcW w:type="dxa" w:w="1800"/>
             <w:tcBorders>
               <w:top w:val="single" w:color="AEB6BF" w:sz="4"/>
               <w:left w:val="single" w:color="AEB6BF" w:sz="4"/>
@@ -3794,13 +4224,13 @@
                 <w:sz w:val="19"/>
                 <w:szCs w:val="19"/>
               </w:rPr>
-              <w:t xml:space="preserve">ARS 375.000</w:t>
-            </w:r>
-          </w:p>
-        </w:tc>
-        <w:tc>
-          <w:tcPr>
-            <w:tcW w:type="dxa" w:w="2944"/>
+              <w:t xml:space="preserve">ARS 14.560.000</w:t>
+            </w:r>
+          </w:p>
+        </w:tc>
+        <w:tc>
+          <w:tcPr>
+            <w:tcW w:type="dxa" w:w="1800"/>
             <w:tcBorders>
               <w:top w:val="single" w:color="AEB6BF" w:sz="4"/>
               <w:left w:val="single" w:color="AEB6BF" w:sz="4"/>
@@ -3830,13 +4260,13 @@
                 <w:sz w:val="19"/>
                 <w:szCs w:val="19"/>
               </w:rPr>
-              <w:t xml:space="preserve">ARS 875.000</w:t>
-            </w:r>
-          </w:p>
-        </w:tc>
-        <w:tc>
-          <w:tcPr>
-            <w:tcW w:type="dxa" w:w="3144"/>
+              <w:t xml:space="preserve">ARS 1.456.000</w:t>
+            </w:r>
+          </w:p>
+        </w:tc>
+        <w:tc>
+          <w:tcPr>
+            <w:tcW w:type="dxa" w:w="1900"/>
             <w:tcBorders>
               <w:top w:val="single" w:color="AEB6BF" w:sz="4"/>
               <w:left w:val="single" w:color="AEB6BF" w:sz="4"/>
@@ -3866,12 +4296,73 @@
                 <w:sz w:val="19"/>
                 <w:szCs w:val="19"/>
               </w:rPr>
-              <w:t xml:space="preserve">ARS 1.250.000</w:t>
+              <w:t xml:space="preserve">ARS 4.804.800</w:t>
+            </w:r>
+          </w:p>
+        </w:tc>
+        <w:tc>
+          <w:tcPr>
+            <w:tcW w:type="dxa" w:w="2238"/>
+            <w:tcBorders>
+              <w:top w:val="single" w:color="AEB6BF" w:sz="4"/>
+              <w:left w:val="single" w:color="AEB6BF" w:sz="4"/>
+              <w:bottom w:val="single" w:color="AEB6BF" w:sz="4"/>
+              <w:right w:val="single" w:color="AEB6BF" w:sz="4"/>
+            </w:tcBorders>
+            <w:shd w:fill="D6EAF8" w:color="auto" w:val="clear"/>
+            <w:tcMar>
+              <w:top w:type="dxa" w:w="90"/>
+              <w:left w:type="dxa" w:w="110"/>
+              <w:bottom w:type="dxa" w:w="90"/>
+              <w:right w:type="dxa" w:w="110"/>
+            </w:tcMar>
+            <w:vAlign w:val="center"/>
+          </w:tcPr>
+          <w:p>
+            <w:pPr>
+              <w:spacing w:after="0" w:line="270"/>
+              <w:jc w:val="right"/>
+            </w:pPr>
+            <w:r>
+              <w:rPr>
+                <w:rFonts w:ascii="Arial" w:cs="Arial" w:eastAsia="Arial" w:hAnsi="Arial"/>
+                <w:b/>
+                <w:bCs/>
+                <w:color w:val="1A202C"/>
+                <w:sz w:val="19"/>
+                <w:szCs w:val="19"/>
+              </w:rPr>
+              <w:t xml:space="preserve">ARS 11.211.200</w:t>
             </w:r>
           </w:p>
         </w:tc>
       </w:tr>
     </w:tbl>
+    <w:p>
+      <w:pPr>
+        <w:spacing w:after="100" w:before="140" w:line="290"/>
+      </w:pPr>
+      <w:r>
+        <w:rPr>
+          <w:rFonts w:ascii="Arial" w:cs="Arial" w:eastAsia="Arial" w:hAnsi="Arial"/>
+          <w:b/>
+          <w:bCs/>
+          <w:color w:val="1A202C"/>
+          <w:sz w:val="19"/>
+          <w:szCs w:val="19"/>
+        </w:rPr>
+        <w:t xml:space="preserve">Cómo se calculó: </w:t>
+      </w:r>
+      <w:r>
+        <w:rPr>
+          <w:rFonts w:ascii="Arial" w:cs="Arial" w:eastAsia="Arial" w:hAnsi="Arial"/>
+          <w:color w:val="1A202C"/>
+          <w:sz w:val="19"/>
+          <w:szCs w:val="19"/>
+        </w:rPr>
+        <w:t xml:space="preserve">1.040 horas de trabajo (2 integrantes × 20 h semanales × 26 semanas) a ARS 14.000 por hora, más una reserva del 10 % para imprevistos. El valor hora parte del tope del sueldo junior en tecnología en Argentina (ARS 1.400.000 mensuales ÷ 160 h = ARS 8.750 por hora) más un 60 % por trabajo independiente (monotributo, ingresos brutos, tiempo no facturable y equipamiento). Dólar oficial de referencia: ARS 1.560 (27/10/2026). Los valores no incluyen IVA y se actualizan por el IPC (INDEC) acumulado entre la firma y el inicio de cada fase.</w:t>
+      </w:r>
+    </w:p>
     <w:p>
       <w:pPr>
         <w:keepNext/>
@@ -3925,7 +4416,7 @@
           <w:sz w:val="21"/>
           <w:szCs w:val="21"/>
         </w:rPr>
-        <w:t xml:space="preserve">Mantenimiento: se incluyen 3 meses de soporte posteriores a la entrega sin costo adicional. Desde el mes 4, el mantenimiento se acuerda por hora.</w:t>
+        <w:t xml:space="preserve">Mantenimiento: se incluyen 3 meses de soporte posteriores a la entrega sin costo adicional. Desde el mes 4, el mantenimiento se cobra a ARS 14.000 por hora, con pedido previo.</w:t>
       </w:r>
     </w:p>
     <w:p>

</xml_diff>

<commit_message>
docs: alinea M9 (PWA offline) y M12 (perfil veterinario) del B1 con README y presentación
Co-Authored-By: Claude Sonnet 5.5 <noreply@anthropic.com>
Claude-Session: https://claude.ai/code/session_016Qvd5iGcwUQveyPKApGB7y
</commit_message>
<xml_diff>
--- a/docs/entregables/B1_Contrato_Alcance_TILCOR.docx
+++ b/docs/entregables/B1_Contrato_Alcance_TILCOR.docx
@@ -990,7 +990,7 @@
           <w:sz w:val="21"/>
           <w:szCs w:val="21"/>
         </w:rPr>
-        <w:t xml:space="preserve">M9 — ACCESO VETERINARIO</w:t>
+        <w:t xml:space="preserve">M9 — PWA MÓVIL OFFLINE</w:t>
       </w:r>
     </w:p>
     <w:p>
@@ -1009,24 +1009,7 @@
           <w:sz w:val="21"/>
           <w:szCs w:val="21"/>
         </w:rPr>
-        <w:t xml:space="preserve">Perfil de solo lectura con historial sanitario y alertas de mortalidad.</w:t>
-      </w:r>
-    </w:p>
-    <w:p>
-      <w:pPr>
-        <w:keepNext/>
-        <w:spacing w:after="60" w:before="160"/>
-      </w:pPr>
-      <w:r>
-        <w:rPr>
-          <w:rFonts w:ascii="Arial" w:cs="Arial" w:eastAsia="Arial" w:hAnsi="Arial"/>
-          <w:b/>
-          <w:bCs/>
-          <w:color w:val="1A5276"/>
-          <w:sz w:val="21"/>
-          <w:szCs w:val="21"/>
-        </w:rPr>
-        <w:t xml:space="preserve">M11 — ROLES Y ACCESO</w:t>
+        <w:t xml:space="preserve">Aplicación instalable en Android e iOS, sin pasar por una tienda.</w:t>
       </w:r>
     </w:p>
     <w:p>
@@ -1045,7 +1028,24 @@
           <w:sz w:val="21"/>
           <w:szCs w:val="21"/>
         </w:rPr>
-        <w:t xml:space="preserve">Cuatro perfiles: Propietario, Supervisor, Operario y Veterinario.</w:t>
+        <w:t xml:space="preserve">Sincronización automática al recuperar señal.</w:t>
+      </w:r>
+    </w:p>
+    <w:p>
+      <w:pPr>
+        <w:keepNext/>
+        <w:spacing w:after="60" w:before="160"/>
+      </w:pPr>
+      <w:r>
+        <w:rPr>
+          <w:rFonts w:ascii="Arial" w:cs="Arial" w:eastAsia="Arial" w:hAnsi="Arial"/>
+          <w:b/>
+          <w:bCs/>
+          <w:color w:val="1A5276"/>
+          <w:sz w:val="21"/>
+          <w:szCs w:val="21"/>
+        </w:rPr>
+        <w:t xml:space="preserve">M11 — ROLES Y ACCESO</w:t>
       </w:r>
     </w:p>
     <w:p>
@@ -1064,24 +1064,7 @@
           <w:sz w:val="21"/>
           <w:szCs w:val="21"/>
         </w:rPr>
-        <w:t xml:space="preserve">Autenticación segura con JWT.</w:t>
-      </w:r>
-    </w:p>
-    <w:p>
-      <w:pPr>
-        <w:keepNext/>
-        <w:spacing w:after="60" w:before="160"/>
-      </w:pPr>
-      <w:r>
-        <w:rPr>
-          <w:rFonts w:ascii="Arial" w:cs="Arial" w:eastAsia="Arial" w:hAnsi="Arial"/>
-          <w:b/>
-          <w:bCs/>
-          <w:color w:val="1A5276"/>
-          <w:sz w:val="21"/>
-          <w:szCs w:val="21"/>
-        </w:rPr>
-        <w:t xml:space="preserve">M12 — PWA MÓVIL OFFLINE</w:t>
+        <w:t xml:space="preserve">Cuatro perfiles: Propietario, Supervisor, Operario y Veterinario.</w:t>
       </w:r>
     </w:p>
     <w:p>
@@ -1100,7 +1083,24 @@
           <w:sz w:val="21"/>
           <w:szCs w:val="21"/>
         </w:rPr>
-        <w:t xml:space="preserve">Aplicación instalable en Android e iOS, sin pasar por una tienda.</w:t>
+        <w:t xml:space="preserve">Autenticación segura con JWT.</w:t>
+      </w:r>
+    </w:p>
+    <w:p>
+      <w:pPr>
+        <w:keepNext/>
+        <w:spacing w:after="60" w:before="160"/>
+      </w:pPr>
+      <w:r>
+        <w:rPr>
+          <w:rFonts w:ascii="Arial" w:cs="Arial" w:eastAsia="Arial" w:hAnsi="Arial"/>
+          <w:b/>
+          <w:bCs/>
+          <w:color w:val="1A5276"/>
+          <w:sz w:val="21"/>
+          <w:szCs w:val="21"/>
+        </w:rPr>
+        <w:t xml:space="preserve">M12 — PERFIL VETERINARIO</w:t>
       </w:r>
     </w:p>
     <w:p>
@@ -1119,7 +1119,7 @@
           <w:sz w:val="21"/>
           <w:szCs w:val="21"/>
         </w:rPr>
-        <w:t xml:space="preserve">Sincronización automática al recuperar señal.</w:t>
+        <w:t xml:space="preserve">Perfil de solo lectura con historial sanitario y alertas de mortalidad.</w:t>
       </w:r>
     </w:p>
     <w:p>
@@ -2605,7 +2605,7 @@
                 <w:sz w:val="19"/>
                 <w:szCs w:val="19"/>
               </w:rPr>
-              <w:t xml:space="preserve">M9 Acceso veterinario y M12 PWA offline</w:t>
+              <w:t xml:space="preserve">M9 PWA offline y M12 Perfil veterinario</w:t>
             </w:r>
           </w:p>
           <w:p>

</xml_diff>